<commit_message>
Completar la carátula de la Actividad 4 con la materia y el profesor
Object Oriented Programming, con los títulos de la actividad y el
módulo en inglés como los usa el curso, y el nombre del profesor
José Abdón Espínola González.

Co-Authored-By: Claude Fable 5 <noreply@anthropic.com>
Claude-Session: https://claude.ai/code/session_015UF77vNc2anNhC4cbLjXz9
</commit_message>
<xml_diff>
--- a/actividad-4-java-melate/Caratula_Actividad4_Java.docx
+++ b/actividad-4-java-melate/Caratula_Actividad4_Java.docx
@@ -79,7 +79,7 @@
           <w:sz w:val="40"/>
           <w:szCs w:val="40"/>
         </w:rPr>
-        <w:t xml:space="preserve">[Nombre de la materia]</w:t>
+        <w:t xml:space="preserve">Object Oriented Programming</w:t>
       </w:r>
     </w:p>
     <w:p>
@@ -147,7 +147,7 @@
           <w:sz w:val="32"/>
           <w:szCs w:val="32"/>
         </w:rPr>
-        <w:t xml:space="preserve">Actividad 4: Generación de números aleatorios para el juego Melate de la Lotería Nacional</w:t>
+        <w:t xml:space="preserve">Activity 4: Generating random numbers for the National Lottery Melate game</w:t>
       </w:r>
     </w:p>
     <w:p>
@@ -164,7 +164,7 @@
           <w:sz w:val="28"/>
           <w:szCs w:val="28"/>
         </w:rPr>
-        <w:t xml:space="preserve">Módulo 4: Clases y objetos en el lenguaje de programación orientado a objetos Java</w:t>
+        <w:t xml:space="preserve">Module 4: Classes and objects in the object-oriented programming language Java</w:t>
       </w:r>
     </w:p>
     <w:p>
@@ -181,7 +181,7 @@
           <w:sz w:val="28"/>
           <w:szCs w:val="28"/>
         </w:rPr>
-        <w:t xml:space="preserve">[Nombre del profesor(a)]</w:t>
+        <w:t xml:space="preserve">José Abdón Espínola González</w:t>
       </w:r>
     </w:p>
     <w:p>

</xml_diff>